<commit_message>
updated README and .env example
</commit_message>
<xml_diff>
--- a/docs/Minecraft Server Checkliste.docx
+++ b/docs/Minecraft Server Checkliste.docx
@@ -66,6 +66,7 @@
               <w:smallCaps w:val="false"/>
               <w:strike w:val="false"/>
               <w:dstrike w:val="false"/>
+              <w:vanish w:val="false"/>
               <w:webHidden/>
               <w:color w:val="000000"/>
               <w:position w:val="0"/>
@@ -89,6 +90,7 @@
               <w:smallCaps w:val="false"/>
               <w:strike w:val="false"/>
               <w:dstrike w:val="false"/>
+              <w:vanish w:val="false"/>
               <w:webHidden/>
               <w:color w:val="000000"/>
               <w:position w:val="0"/>
@@ -113,6 +115,7 @@
                 <w:smallCaps w:val="false"/>
                 <w:strike w:val="false"/>
                 <w:dstrike w:val="false"/>
+                <w:vanish w:val="false"/>
                 <w:webHidden/>
                 <w:color w:val="000000"/>
                 <w:position w:val="0"/>
@@ -123,6 +126,28 @@
                 <w:vertAlign w:val="baseline"/>
               </w:rPr>
               <w:t>Projektabgabe - Eigener Minecraft-Server</w:t>
+            </w:r>
+            <w:r>
+              <w:rPr>
+                <w:rStyle w:val="IndexLink"/>
+                <w:rFonts w:eastAsia="Arial" w:cs="Arial" w:ascii="Arial" w:hAnsi="Arial"/>
+                <w:b/>
+                <w:bCs/>
+                <w:i w:val="false"/>
+                <w:iCs w:val="false"/>
+                <w:caps w:val="false"/>
+                <w:smallCaps w:val="false"/>
+                <w:strike w:val="false"/>
+                <w:dstrike w:val="false"/>
+                <w:vanish w:val="false"/>
+                <w:color w:val="000000"/>
+                <w:position w:val="0"/>
+                <w:sz w:val="22"/>
+                <w:szCs w:val="22"/>
+                <w:u w:val="none"/>
+                <w:shd w:fill="auto" w:val="clear"/>
+                <w:vertAlign w:val="baseline"/>
+              </w:rPr>
               <w:tab/>
               <w:t>2</w:t>
             </w:r>
@@ -170,6 +195,7 @@
                 <w:smallCaps w:val="false"/>
                 <w:strike w:val="false"/>
                 <w:dstrike w:val="false"/>
+                <w:vanish w:val="false"/>
                 <w:webHidden/>
                 <w:color w:val="000000"/>
                 <w:position w:val="0"/>
@@ -227,6 +253,7 @@
                 <w:smallCaps w:val="false"/>
                 <w:strike w:val="false"/>
                 <w:dstrike w:val="false"/>
+                <w:vanish w:val="false"/>
                 <w:webHidden/>
                 <w:color w:val="000000"/>
                 <w:position w:val="0"/>
@@ -284,6 +311,7 @@
                 <w:smallCaps w:val="false"/>
                 <w:strike w:val="false"/>
                 <w:dstrike w:val="false"/>
+                <w:vanish w:val="false"/>
                 <w:webHidden/>
                 <w:color w:val="000000"/>
                 <w:position w:val="0"/>
@@ -341,6 +369,7 @@
                 <w:smallCaps w:val="false"/>
                 <w:strike w:val="false"/>
                 <w:dstrike w:val="false"/>
+                <w:vanish w:val="false"/>
                 <w:webHidden/>
                 <w:color w:val="000000"/>
                 <w:position w:val="0"/>
@@ -398,6 +427,7 @@
                 <w:smallCaps w:val="false"/>
                 <w:strike w:val="false"/>
                 <w:dstrike w:val="false"/>
+                <w:vanish w:val="false"/>
                 <w:webHidden/>
                 <w:color w:val="000000"/>
                 <w:position w:val="0"/>
@@ -455,6 +485,7 @@
                 <w:smallCaps w:val="false"/>
                 <w:strike w:val="false"/>
                 <w:dstrike w:val="false"/>
+                <w:vanish w:val="false"/>
                 <w:webHidden/>
                 <w:color w:val="000000"/>
                 <w:position w:val="0"/>
@@ -512,6 +543,7 @@
                 <w:smallCaps w:val="false"/>
                 <w:strike w:val="false"/>
                 <w:dstrike w:val="false"/>
+                <w:vanish w:val="false"/>
                 <w:webHidden/>
                 <w:color w:val="000000"/>
                 <w:position w:val="0"/>
@@ -569,6 +601,7 @@
                 <w:smallCaps w:val="false"/>
                 <w:strike w:val="false"/>
                 <w:dstrike w:val="false"/>
+                <w:vanish w:val="false"/>
                 <w:webHidden/>
                 <w:color w:val="000000"/>
                 <w:position w:val="0"/>
@@ -626,6 +659,7 @@
                 <w:smallCaps w:val="false"/>
                 <w:strike w:val="false"/>
                 <w:dstrike w:val="false"/>
+                <w:vanish w:val="false"/>
                 <w:webHidden/>
                 <w:color w:val="000000"/>
                 <w:position w:val="0"/>
@@ -683,6 +717,7 @@
                 <w:smallCaps w:val="false"/>
                 <w:strike w:val="false"/>
                 <w:dstrike w:val="false"/>
+                <w:vanish w:val="false"/>
                 <w:webHidden/>
                 <w:color w:val="000000"/>
                 <w:position w:val="0"/>
@@ -709,6 +744,7 @@
               <w:smallCaps w:val="false"/>
               <w:strike w:val="false"/>
               <w:dstrike w:val="false"/>
+              <w:vanish w:val="false"/>
               <w:color w:val="000000"/>
               <w:position w:val="0"/>
               <w:sz w:val="22"/>
@@ -770,6 +806,7 @@
     <w:p>
       <w:pPr>
         <w:pStyle w:val="Heading1"/>
+        <w:spacing w:before="0" w:after="200"/>
         <w:rPr/>
       </w:pPr>
       <w:r>
@@ -950,10 +987,14 @@
           <w:numId w:val="0"/>
         </w:numPr>
         <w:ind w:hanging="0" w:start="720"/>
-        <w:rPr/>
-      </w:pPr>
-      <w:r>
-        <w:rPr/>
+        <w:rPr>
+          <w:strike/>
+        </w:rPr>
+      </w:pPr>
+      <w:r>
+        <w:rPr>
+          <w:strike/>
+        </w:rPr>
         <w:t>Es gibt ein Dockerfile in dem ein passendes Image zusammengestellt wird, um einen minecraft-server zu starten</w:t>
       </w:r>
     </w:p>
@@ -966,22 +1007,27 @@
         </w:numPr>
         <w:ind w:hanging="0" w:start="1440"/>
         <w:rPr>
-          <w:u w:val="none"/>
-        </w:rPr>
-      </w:pPr>
-      <w:r>
-        <w:rPr/>
+          <w:strike/>
+        </w:rPr>
+      </w:pPr>
+      <w:r>
+        <w:rPr>
+          <w:strike/>
+        </w:rPr>
         <w:t xml:space="preserve">siehe </w:t>
       </w:r>
       <w:r>
         <w:rPr>
           <w:b/>
           <w:bCs/>
+          <w:strike/>
         </w:rPr>
         <w:t xml:space="preserve">3. Hinweise </w:t>
       </w:r>
       <w:r>
-        <w:rPr/>
+        <w:rPr>
+          <w:strike/>
+        </w:rPr>
         <w:t>für den Download-Link zur Server-Anwendung</w:t>
       </w:r>
     </w:p>
@@ -994,11 +1040,13 @@
         </w:numPr>
         <w:ind w:hanging="0" w:start="720"/>
         <w:rPr>
-          <w:u w:val="none"/>
-        </w:rPr>
-      </w:pPr>
-      <w:r>
-        <w:rPr/>
+          <w:strike/>
+        </w:rPr>
+      </w:pPr>
+      <w:r>
+        <w:rPr>
+          <w:strike/>
+        </w:rPr>
         <w:t>Im Dockerfile sollen alle notwendigen pakete im Basis-Image installiert und ggf. konfiguriert werden</w:t>
       </w:r>
     </w:p>
@@ -1011,11 +1059,13 @@
         </w:numPr>
         <w:ind w:hanging="0" w:start="720"/>
         <w:rPr>
-          <w:u w:val="none"/>
-        </w:rPr>
-      </w:pPr>
-      <w:r>
-        <w:rPr/>
+          <w:strike/>
+        </w:rPr>
+      </w:pPr>
+      <w:r>
+        <w:rPr>
+          <w:strike/>
+        </w:rPr>
         <w:t>Stelle sicher, dass dein Server immer starten kann, für Umgebungs-Variablen solltest du evtl. Default-Werte verwenden</w:t>
       </w:r>
     </w:p>
@@ -1028,11 +1078,13 @@
         </w:numPr>
         <w:ind w:hanging="360" w:start="720"/>
         <w:rPr>
-          <w:u w:val="none"/>
-        </w:rPr>
-      </w:pPr>
-      <w:r>
-        <w:rPr/>
+          <w:strike/>
+        </w:rPr>
+      </w:pPr>
+      <w:r>
+        <w:rPr>
+          <w:strike/>
+        </w:rPr>
         <w:t>Du solltest dabei kein vorgefertigtes Minecraft Image verwenden</w:t>
       </w:r>
     </w:p>
@@ -1065,10 +1117,14 @@
           <w:numId w:val="6"/>
         </w:numPr>
         <w:ind w:hanging="360" w:start="720"/>
-        <w:rPr/>
-      </w:pPr>
-      <w:r>
-        <w:rPr/>
+        <w:rPr>
+          <w:strike/>
+        </w:rPr>
+      </w:pPr>
+      <w:r>
+        <w:rPr>
+          <w:strike/>
+        </w:rPr>
         <w:t>Es gibt einen Service, der definiert und konfiguriert wird: mc-server</w:t>
       </w:r>
     </w:p>
@@ -1084,10 +1140,14 @@
           <w:tab w:val="right" w:pos="285" w:leader="none"/>
         </w:tabs>
         <w:ind w:hanging="360" w:start="720"/>
-        <w:rPr/>
-      </w:pPr>
-      <w:r>
-        <w:rPr/>
+        <w:rPr>
+          <w:strike/>
+        </w:rPr>
+      </w:pPr>
+      <w:r>
+        <w:rPr>
+          <w:strike/>
+        </w:rPr>
         <w:t>Es gibt eine Env Konfiguration für den Minecraft-Server Service bei der alle unkritischen Variablen konfiguriert werden (keine Auth!)</w:t>
       </w:r>
     </w:p>
@@ -1124,10 +1184,14 @@
           <w:tab w:val="right" w:pos="285" w:leader="none"/>
         </w:tabs>
         <w:ind w:hanging="360" w:start="720"/>
-        <w:rPr/>
-      </w:pPr>
-      <w:r>
-        <w:rPr/>
+        <w:rPr>
+          <w:strike/>
+        </w:rPr>
+      </w:pPr>
+      <w:r>
+        <w:rPr>
+          <w:strike/>
+        </w:rPr>
         <w:t>Es gibt Volumes-Konfigurationen für die Container Daten, sodass die Inhalte auf einem Dateisystem persistiert werden und der Spielstand nicht verloren geht</w:t>
       </w:r>
     </w:p>
@@ -1151,10 +1215,14 @@
           <w:numId w:val="6"/>
         </w:numPr>
         <w:ind w:hanging="360" w:start="720"/>
-        <w:rPr/>
-      </w:pPr>
-      <w:r>
-        <w:rPr/>
+        <w:rPr>
+          <w:strike/>
+        </w:rPr>
+      </w:pPr>
+      <w:r>
+        <w:rPr>
+          <w:strike/>
+        </w:rPr>
         <w:t>Die README sollte ein Inhaltsverzeichnis a.k.a. eine Table-of-Contents (ToC) enthalten</w:t>
       </w:r>
     </w:p>
@@ -1166,10 +1234,14 @@
           <w:numId w:val="6"/>
         </w:numPr>
         <w:ind w:hanging="360" w:start="720"/>
-        <w:rPr/>
-      </w:pPr>
-      <w:r>
-        <w:rPr/>
+        <w:rPr>
+          <w:strike/>
+        </w:rPr>
+      </w:pPr>
+      <w:r>
+        <w:rPr>
+          <w:strike/>
+        </w:rPr>
         <w:t>Eine Sektion mit einer Beschreibung des Repositories muss vorhanden sein. In dieser Beschreibung sollte genannt werden was die wesentlichen Inhalte sind, was der Zweck des Repositories ist</w:t>
       </w:r>
     </w:p>
@@ -1185,10 +1257,14 @@
           <w:tab w:val="right" w:pos="285" w:leader="none"/>
         </w:tabs>
         <w:ind w:hanging="360" w:start="720"/>
-        <w:rPr/>
-      </w:pPr>
-      <w:r>
-        <w:rPr/>
+        <w:rPr>
+          <w:strike/>
+        </w:rPr>
+      </w:pPr>
+      <w:r>
+        <w:rPr>
+          <w:strike/>
+        </w:rPr>
         <w:t>Eine Sektion "Quickstart" sollte als Teil der README enthalten sein. Hier sollten kurz Voraussetzungen genannt und eine Schnellstart-Anleitung beschrieben sein.</w:t>
       </w:r>
     </w:p>
@@ -1204,10 +1280,14 @@
           <w:tab w:val="right" w:pos="285" w:leader="none"/>
         </w:tabs>
         <w:ind w:hanging="360" w:start="720"/>
-        <w:rPr/>
-      </w:pPr>
-      <w:r>
-        <w:rPr/>
+        <w:rPr>
+          <w:strike/>
+        </w:rPr>
+      </w:pPr>
+      <w:r>
+        <w:rPr>
+          <w:strike/>
+        </w:rPr>
         <w:t>Es ausführliche Variante der vorgenannten Sektion so als "Usage" enthalten sein. Hier soll genauer auf die Konfiguration und Konfigurierbarkeit eingegangen werden, d.h. es soll auch erklärt werden wie relevante Passagen modifiziert werden können, um andere Resultate zu erzielen.</w:t>
       </w:r>
     </w:p>
@@ -1375,10 +1455,14 @@
           <w:numId w:val="6"/>
         </w:numPr>
         <w:ind w:hanging="360" w:start="720"/>
-        <w:rPr/>
-      </w:pPr>
-      <w:r>
-        <w:rPr/>
+        <w:rPr>
+          <w:strike/>
+        </w:rPr>
+      </w:pPr>
+      <w:r>
+        <w:rPr>
+          <w:strike/>
+        </w:rPr>
         <w:t>Speichere keine SSH-Keys im Workspace deines Git-Repositories</w:t>
       </w:r>
     </w:p>
@@ -1394,10 +1478,14 @@
           <w:tab w:val="right" w:pos="285" w:leader="none"/>
         </w:tabs>
         <w:ind w:hanging="360" w:start="720"/>
-        <w:rPr/>
-      </w:pPr>
-      <w:r>
-        <w:rPr/>
+        <w:rPr>
+          <w:strike/>
+        </w:rPr>
+      </w:pPr>
+      <w:r>
+        <w:rPr>
+          <w:strike/>
+        </w:rPr>
         <w:t>Speichere keine Passwörter, Tokens, oder Benutzernamen in deinem Code. Verwende hierfür stattdessen Environment-Variablen</w:t>
       </w:r>
     </w:p>
@@ -1413,10 +1501,14 @@
           <w:tab w:val="right" w:pos="285" w:leader="none"/>
         </w:tabs>
         <w:ind w:hanging="360" w:start="720"/>
-        <w:rPr/>
-      </w:pPr>
-      <w:r>
-        <w:rPr/>
+        <w:rPr>
+          <w:strike/>
+        </w:rPr>
+      </w:pPr>
+      <w:r>
+        <w:rPr>
+          <w:strike/>
+        </w:rPr>
         <w:t>Speichere keine IP-Adressen, oder sonstigen sensiblen Informationen in einem Git Repository</w:t>
       </w:r>
     </w:p>
@@ -1440,10 +1532,14 @@
           <w:numId w:val="4"/>
         </w:numPr>
         <w:ind w:hanging="360" w:start="720"/>
-        <w:rPr/>
-      </w:pPr>
-      <w:r>
-        <w:rPr/>
+        <w:rPr>
+          <w:strike/>
+        </w:rPr>
+      </w:pPr>
+      <w:r>
+        <w:rPr>
+          <w:strike/>
+        </w:rPr>
         <w:t>Für build-args, environment Variablen und Shell-Variablen gilt folgende Namenskonvention: UPPER_CASE_WITH_UNDERSCORE</w:t>
       </w:r>
     </w:p>
@@ -1459,24 +1555,32 @@
           <w:tab w:val="right" w:pos="285" w:leader="none"/>
         </w:tabs>
         <w:ind w:hanging="360" w:start="720"/>
-        <w:rPr/>
-      </w:pPr>
-      <w:r>
-        <w:rPr/>
+        <w:rPr>
+          <w:strike/>
+        </w:rPr>
+      </w:pPr>
+      <w:r>
+        <w:rPr>
+          <w:strike/>
+        </w:rPr>
         <w:t xml:space="preserve">Bei einer Referenz auf eine Variable sollte immer die {}-Notation verwendet werden um Fehler in der Interpretation zu vermeiden: </w:t>
       </w:r>
       <w:r>
         <w:rPr>
+          <w:strike/>
           <w:color w:val="6AA84F"/>
         </w:rPr>
         <w:t>${SOME_VAR_VALUE}</w:t>
       </w:r>
       <w:r>
-        <w:rPr/>
+        <w:rPr>
+          <w:strike/>
+        </w:rPr>
         <w:t xml:space="preserve">, statt: </w:t>
       </w:r>
       <w:r>
         <w:rPr>
+          <w:strike/>
           <w:color w:val="A61C00"/>
         </w:rPr>
         <w:t>$SOME_VAR_VALUE</w:t>
@@ -1494,10 +1598,14 @@
           <w:tab w:val="right" w:pos="285" w:leader="none"/>
         </w:tabs>
         <w:ind w:hanging="360" w:start="720"/>
-        <w:rPr/>
-      </w:pPr>
-      <w:r>
-        <w:rPr/>
+        <w:rPr>
+          <w:strike/>
+        </w:rPr>
+      </w:pPr>
+      <w:r>
+        <w:rPr>
+          <w:strike/>
+        </w:rPr>
         <w:t>Es sollten für build-args, oder Environment Variablen "Default"-Werte konfiguriert werden, allerdings nur dann wenn dies Sinn ergibt.</w:t>
       </w:r>
     </w:p>
@@ -1513,10 +1621,14 @@
           <w:tab w:val="right" w:pos="285" w:leader="none"/>
         </w:tabs>
         <w:ind w:hanging="360" w:start="720"/>
-        <w:rPr/>
-      </w:pPr>
-      <w:r>
-        <w:rPr/>
+        <w:rPr>
+          <w:strike/>
+        </w:rPr>
+      </w:pPr>
+      <w:r>
+        <w:rPr>
+          <w:strike/>
+        </w:rPr>
         <w:t>Kritische Konfiguration wie Tokens, Passwörter oder ähnliches sollte nicht im Code-Repository gespeichert sein, sondern bspw. durch die Verwendung eines .env-files in einen Container hineingegeben werden</w:t>
       </w:r>
     </w:p>
@@ -1573,13 +1685,16 @@
         <w:rPr/>
       </w:pPr>
       <w:r>
-        <w:rPr/>
+        <w:rPr>
+          <w:strike/>
+        </w:rPr>
         <w:t xml:space="preserve">Für das Testen hast du grundsätzlich zwei Wege: das Spiel starten und versuchen dich auf deinen Server zu verbinden (siehe nächster Punkt), oder mittels eines Skriptes versuchen eine Verbindung zum Minecraft Server aufzubauen. Dazu kannst du das folgende Python Modul verwenden: </w:t>
       </w:r>
       <w:hyperlink r:id="rId3">
         <w:r>
           <w:rPr>
             <w:rStyle w:val="Style3"/>
+            <w:strike/>
             <w:color w:val="1155CC"/>
             <w:u w:val="single"/>
           </w:rPr>
@@ -1587,7 +1702,9 @@
         </w:r>
       </w:hyperlink>
       <w:r>
-        <w:rPr/>
+        <w:rPr>
+          <w:strike/>
+        </w:rPr>
         <w:t xml:space="preserve"> </w:t>
       </w:r>
     </w:p>
@@ -1603,10 +1720,14 @@
           <w:tab w:val="right" w:pos="285" w:leader="none"/>
         </w:tabs>
         <w:ind w:hanging="360" w:start="720"/>
-        <w:rPr/>
-      </w:pPr>
-      <w:r>
-        <w:rPr/>
+        <w:rPr>
+          <w:strike/>
+        </w:rPr>
+      </w:pPr>
+      <w:r>
+        <w:rPr>
+          <w:strike/>
+        </w:rPr>
         <w:t>(optional) Du kannst dich von deinem Java-Minecraft Client auf deinem Computer mit dem Server auf deiner Cloud-VM verbinden und Minecraft spielen.</w:t>
       </w:r>
     </w:p>
@@ -1622,10 +1743,14 @@
           <w:tab w:val="right" w:pos="285" w:leader="none"/>
         </w:tabs>
         <w:ind w:hanging="360" w:start="720"/>
-        <w:rPr/>
-      </w:pPr>
-      <w:r>
-        <w:rPr/>
+        <w:rPr>
+          <w:strike/>
+        </w:rPr>
+      </w:pPr>
+      <w:r>
+        <w:rPr>
+          <w:strike/>
+        </w:rPr>
         <w:t>Nach einem Neustart des Servers sind die konfigurierten Daten noch vorhanden und werden nicht gelöscht oder überschrieben. Dazu gehört unter anderem der Spielstand und die Konfiguration des Game-Servers</w:t>
       </w:r>
     </w:p>
@@ -1641,10 +1766,14 @@
           <w:tab w:val="right" w:pos="285" w:leader="none"/>
         </w:tabs>
         <w:ind w:hanging="360" w:start="720"/>
-        <w:rPr/>
-      </w:pPr>
-      <w:r>
-        <w:rPr/>
+        <w:rPr>
+          <w:strike/>
+        </w:rPr>
+      </w:pPr>
+      <w:r>
+        <w:rPr>
+          <w:strike/>
+        </w:rPr>
         <w:t>Die Container der Services werden neugestartet, sobald ein Fehler passiert, der zum Terminieren des Containers führt.</w:t>
       </w:r>
     </w:p>
@@ -1763,7 +1892,6 @@
             <w:keepNext w:val="false"/>
             <w:keepLines w:val="false"/>
             <w:widowControl w:val="false"/>
-            <w:pBdr/>
             <w:shd w:val="clear" w:fill="auto"/>
             <w:spacing w:lineRule="auto" w:line="240" w:before="0" w:after="0"/>
             <w:ind w:hanging="0" w:start="0" w:end="0"/>
@@ -1817,7 +1945,6 @@
             <w:keepNext w:val="false"/>
             <w:keepLines w:val="false"/>
             <w:widowControl w:val="false"/>
-            <w:pBdr/>
             <w:shd w:val="clear" w:fill="auto"/>
             <w:spacing w:lineRule="auto" w:line="240" w:before="0" w:after="0"/>
             <w:ind w:hanging="0" w:start="0" w:end="0"/>
@@ -1855,7 +1982,6 @@
             <w:keepNext w:val="false"/>
             <w:keepLines w:val="false"/>
             <w:widowControl w:val="false"/>
-            <w:pBdr/>
             <w:shd w:val="clear" w:fill="auto"/>
             <w:spacing w:lineRule="auto" w:line="240" w:before="0" w:after="0"/>
             <w:ind w:hanging="0" w:start="0" w:end="-40"/>
@@ -1893,7 +2019,6 @@
             <w:keepNext w:val="false"/>
             <w:keepLines w:val="false"/>
             <w:widowControl w:val="false"/>
-            <w:pBdr/>
             <w:shd w:val="clear" w:fill="auto"/>
             <w:spacing w:lineRule="auto" w:line="240" w:before="0" w:after="0"/>
             <w:ind w:hanging="0" w:start="0" w:end="0"/>
@@ -1920,7 +2045,6 @@
             <w:keepNext w:val="false"/>
             <w:keepLines w:val="false"/>
             <w:widowControl w:val="false"/>
-            <w:pBdr/>
             <w:shd w:val="clear" w:fill="auto"/>
             <w:spacing w:lineRule="auto" w:line="240" w:before="0" w:after="0"/>
             <w:ind w:hanging="0" w:start="0" w:end="0"/>
@@ -1956,7 +2080,6 @@
             <w:keepNext w:val="false"/>
             <w:keepLines w:val="false"/>
             <w:widowControl w:val="false"/>
-            <w:pBdr/>
             <w:shd w:val="clear" w:fill="auto"/>
             <w:spacing w:lineRule="auto" w:line="240" w:before="0" w:after="0"/>
             <w:ind w:hanging="0" w:start="0" w:end="0"/>
@@ -2051,7 +2174,6 @@
             <w:keepNext w:val="false"/>
             <w:keepLines w:val="false"/>
             <w:widowControl w:val="false"/>
-            <w:pBdr/>
             <w:shd w:val="clear" w:fill="auto"/>
             <w:spacing w:lineRule="auto" w:line="240" w:before="0" w:after="0"/>
             <w:ind w:hanging="0" w:start="0" w:end="0"/>
@@ -2105,7 +2227,6 @@
             <w:keepNext w:val="false"/>
             <w:keepLines w:val="false"/>
             <w:widowControl w:val="false"/>
-            <w:pBdr/>
             <w:shd w:val="clear" w:fill="auto"/>
             <w:spacing w:lineRule="auto" w:line="240" w:before="0" w:after="0"/>
             <w:ind w:hanging="0" w:start="0" w:end="0"/>
@@ -2143,7 +2264,6 @@
             <w:keepNext w:val="false"/>
             <w:keepLines w:val="false"/>
             <w:widowControl w:val="false"/>
-            <w:pBdr/>
             <w:shd w:val="clear" w:fill="auto"/>
             <w:spacing w:lineRule="auto" w:line="240" w:before="0" w:after="0"/>
             <w:ind w:hanging="0" w:start="0" w:end="-40"/>
@@ -2181,7 +2301,6 @@
             <w:keepNext w:val="false"/>
             <w:keepLines w:val="false"/>
             <w:widowControl w:val="false"/>
-            <w:pBdr/>
             <w:shd w:val="clear" w:fill="auto"/>
             <w:spacing w:lineRule="auto" w:line="240" w:before="0" w:after="0"/>
             <w:ind w:hanging="0" w:start="0" w:end="0"/>
@@ -2208,7 +2327,6 @@
             <w:keepNext w:val="false"/>
             <w:keepLines w:val="false"/>
             <w:widowControl w:val="false"/>
-            <w:pBdr/>
             <w:shd w:val="clear" w:fill="auto"/>
             <w:spacing w:lineRule="auto" w:line="240" w:before="0" w:after="0"/>
             <w:ind w:hanging="0" w:start="0" w:end="0"/>
@@ -2244,7 +2362,6 @@
             <w:keepNext w:val="false"/>
             <w:keepLines w:val="false"/>
             <w:widowControl w:val="false"/>
-            <w:pBdr/>
             <w:shd w:val="clear" w:fill="auto"/>
             <w:spacing w:lineRule="auto" w:line="240" w:before="0" w:after="0"/>
             <w:ind w:hanging="0" w:start="0" w:end="0"/>
@@ -3457,6 +3574,7 @@
     <w:qFormat/>
     <w:pPr>
       <w:widowControl/>
+      <w:suppressAutoHyphens w:val="true"/>
       <w:bidi w:val="0"/>
       <w:spacing w:lineRule="auto" w:line="276" w:before="0" w:after="0"/>
       <w:jc w:val="start"/>
@@ -3648,6 +3766,7 @@
     <w:qFormat/>
     <w:pPr>
       <w:widowControl/>
+      <w:suppressAutoHyphens w:val="true"/>
       <w:bidi w:val="0"/>
       <w:spacing w:lineRule="auto" w:line="276" w:before="0" w:after="0"/>
       <w:jc w:val="start"/>

</xml_diff>